<commit_message>
Refactor EnemyAnalysis component to remove damageType filter and related logic
- Removed damageType from DEFAULT_FILTERS and EnemyFilters interface.
- Eliminated DAMAGE_TYPE_LABELS and related logic in EnemyAnalysis.
- Updated filtering logic to exclude damageType.
- Modified tests to reflect the removal of damageType filtering.
- Adjusted UI components to remove damageType selection.
- Updated documentation to reflect changes in enemy analysis functionality.
</commit_message>
<xml_diff>
--- a/docs/enemy-defense-resistance-notation-guide.docx
+++ b/docs/enemy-defense-resistance-notation-guide.docx
@@ -35,7 +35,7 @@
           <w:sz w:val="56"/>
           <w:lang w:val="ja-JP" w:eastAsia="ja-JP"/>
         </w:rPr>
-        <w:t>敵の防御力・術耐性　ゲーム内表記ガイド</w:t>
+        <w:t>敵の防御力・術耐性 表記ガイド</w:t>
       </w:r>
     </w:p>
     <w:p>
@@ -252,12 +252,110 @@
         <w:t>値が欠損・未定義・非数値の場合は評価できないため「—」と表示します。</w:t>
       </w:r>
     </w:p>
+    <w:tbl>
+      <w:tblPr>
+        <w:tblW w:type="dxa" w:w="9360"/>
+        <w:tblLayout w:type="fixed"/>
+        <w:tblLook w:firstColumn="1" w:firstRow="1" w:lastColumn="0" w:lastRow="0" w:noHBand="0" w:noVBand="1" w:val="04A0"/>
+        <w:tblInd w:type="dxa" w:w="120"/>
+      </w:tblPr>
+      <w:tblGrid>
+        <w:gridCol w:w="9360"/>
+      </w:tblGrid>
+      <w:tr>
+        <w:tc>
+          <w:tcPr>
+            <w:tcW w:type="dxa" w:w="9360"/>
+            <w:tcMar>
+              <w:top w:w="130" w:type="dxa"/>
+              <w:bottom w:w="130" w:type="dxa"/>
+              <w:start w:w="170" w:type="dxa"/>
+              <w:end w:w="150" w:type="dxa"/>
+            </w:tcMar>
+            <w:vAlign w:val="center"/>
+            <w:shd w:fill="F4F6F9" w:val="clear"/>
+            <w:tcBorders>
+              <w:left w:val="single" w:sz="22" w:space="0" w:color="2E74B5"/>
+            </w:tcBorders>
+          </w:tcPr>
+          <w:p>
+            <w:pPr>
+              <w:keepNext w:val="0"/>
+              <w:keepLines/>
+              <w:spacing w:before="0" w:after="80" w:line="276" w:lineRule="auto"/>
+              <w:jc w:val="left"/>
+            </w:pPr>
+            <w:r>
+              <w:rPr>
+                <w:rFonts w:ascii="Calibri" w:hAnsi="Calibri" w:eastAsia="Yu Gothic"/>
+                <w:b/>
+                <w:i w:val="0"/>
+                <w:color w:val="1F4D78"/>
+                <w:sz w:val="20"/>
+                <w:lang w:val="ja-JP" w:eastAsia="ja-JP"/>
+              </w:rPr>
+              <w:t>10段階の順序</w:t>
+            </w:r>
+          </w:p>
+          <w:p>
+            <w:pPr>
+              <w:keepNext w:val="0"/>
+              <w:keepLines/>
+              <w:spacing w:before="0" w:after="0" w:line="300" w:lineRule="auto"/>
+              <w:jc w:val="left"/>
+            </w:pPr>
+            <w:r>
+              <w:rPr>
+                <w:rFonts w:ascii="Calibri" w:hAnsi="Calibri" w:eastAsia="Yu Gothic"/>
+                <w:b w:val="0"/>
+                <w:i w:val="0"/>
+                <w:color w:val="222222"/>
+                <w:sz w:val="21"/>
+                <w:lang w:val="ja-JP" w:eastAsia="ja-JP"/>
+              </w:rPr>
+              <w:t>左ほど低く、右ほど高い評価です。「+」を含む文字は独立した段階として扱います。</w:t>
+            </w:r>
+          </w:p>
+          <w:p>
+            <w:pPr>
+              <w:keepNext w:val="0"/>
+              <w:keepLines/>
+              <w:spacing w:before="0" w:after="40" w:line="264" w:lineRule="auto"/>
+              <w:jc w:val="left"/>
+            </w:pPr>
+            <w:r>
+              <w:rPr>
+                <w:rFonts w:ascii="Consolas" w:hAnsi="Consolas" w:eastAsia="Yu Gothic"/>
+                <w:b/>
+                <w:i w:val="0"/>
+                <w:color w:val="0B2545"/>
+                <w:sz w:val="20"/>
+                <w:lang w:val="ja-JP" w:eastAsia="ja-JP"/>
+              </w:rPr>
+              <w:t>E &lt; D &lt; C &lt; B &lt; B+ &lt; A &lt; A+ &lt; S &lt; S+ &lt; SS</w:t>
+            </w:r>
+          </w:p>
+        </w:tc>
+      </w:tr>
+    </w:tbl>
     <w:p>
       <w:pPr>
-        <w:pStyle w:val="Heading2"/>
+        <w:keepNext w:val="0"/>
+        <w:keepLines w:val="0"/>
+        <w:spacing w:before="0" w:after="40" w:line="240" w:lineRule="auto"/>
+      </w:pPr>
+    </w:p>
+    <w:p>
+      <w:r>
+        <w:br w:type="page"/>
+      </w:r>
+    </w:p>
+    <w:p>
+      <w:pPr>
+        <w:pStyle w:val="Heading1"/>
         <w:keepNext/>
         <w:keepLines w:val="0"/>
-        <w:spacing w:before="280" w:after="140" w:line="240" w:lineRule="auto"/>
+        <w:spacing w:before="360" w:after="200" w:line="240" w:lineRule="auto"/>
       </w:pPr>
       <w:r>
         <w:rPr>
@@ -265,10 +363,10 @@
           <w:b/>
           <w:i w:val="0"/>
           <w:color w:val="2E74B5"/>
-          <w:sz w:val="26"/>
+          <w:sz w:val="32"/>
           <w:lang w:val="ja-JP" w:eastAsia="ja-JP"/>
         </w:rPr>
-        <w:t>本アプリの換算条件</w:t>
+        <w:t>2. 本アプリの換算条件</w:t>
       </w:r>
     </w:p>
     <w:tbl>
@@ -1638,7 +1736,7 @@
           <w:sz w:val="17"/>
           <w:lang w:val="ja-JP" w:eastAsia="ja-JP"/>
         </w:rPr>
-        <w:t>注: 判定は丸め前の値に対して行います。整数の目安は読みやすさのための併記です。境界上では、防御力5000・術耐性90はいずれもS+で、それを超えるとSSです。</w:t>
+        <w:t>注: 公式にランク境界の数値表はないため、本表は2026-08-31時点の本アプリ実装値です。判定は丸め前の値に対して行い、整数の目安は読みやすさのために併記しています。境界上では、防御力5000・術耐性90はいずれもS+で、それを超えるとSSです。</w:t>
       </w:r>
     </w:p>
     <w:p>
@@ -1662,7 +1760,7 @@
           <w:sz w:val="32"/>
           <w:lang w:val="ja-JP" w:eastAsia="ja-JP"/>
         </w:rPr>
-        <w:t>2. 防御力と術耐性は、同じ文字でも働きが違う</w:t>
+        <w:t>3. 防御力と術耐性は、同じ文字でも働きが違う</w:t>
       </w:r>
     </w:p>
     <w:p>
@@ -2122,7 +2220,7 @@
           <w:ilvl w:val="0"/>
           <w:numId w:val="10"/>
         </w:numPr>
-        <w:spacing w:before="0" w:after="80" w:line="300" w:lineRule="auto"/>
+        <w:spacing w:before="0" w:after="60" w:line="300" w:lineRule="auto"/>
       </w:pPr>
       <w:r>
         <w:rPr>
@@ -2130,10 +2228,10 @@
           <w:b w:val="0"/>
           <w:i w:val="0"/>
           <w:color w:val="222222"/>
-          <w:sz w:val="22"/>
+          <w:sz w:val="20"/>
           <w:lang w:val="ja-JP" w:eastAsia="ja-JP"/>
         </w:rPr>
-        <w:t>低い1ヒット攻撃力の物理攻撃は、防御力に大きく差し引かれやすく、最低保証の5%へ到達しやすくなります。</w:t>
+        <w:t>物理攻撃は1ヒット攻撃力が低いほど防御力に止められやすく、高いほど防御力を上回った分を通しやすくなります。</w:t>
       </w:r>
     </w:p>
     <w:p>
@@ -2144,7 +2242,7 @@
           <w:ilvl w:val="0"/>
           <w:numId w:val="10"/>
         </w:numPr>
-        <w:spacing w:before="0" w:after="80" w:line="300" w:lineRule="auto"/>
+        <w:spacing w:before="0" w:after="60" w:line="300" w:lineRule="auto"/>
       </w:pPr>
       <w:r>
         <w:rPr>
@@ -2152,10 +2250,10 @@
           <w:b w:val="0"/>
           <w:i w:val="0"/>
           <w:color w:val="222222"/>
-          <w:sz w:val="22"/>
+          <w:sz w:val="20"/>
           <w:lang w:val="ja-JP" w:eastAsia="ja-JP"/>
         </w:rPr>
-        <w:t>高い1ヒット攻撃力の物理攻撃は、防御力を上回った分を通しやすくなります。</w:t>
+        <w:t>術耐性は割合軽減なので、同じRESなら攻撃力が変わっても軽減率は原則同じです。</w:t>
       </w:r>
     </w:p>
     <w:p>
@@ -2166,7 +2264,7 @@
           <w:ilvl w:val="0"/>
           <w:numId w:val="10"/>
         </w:numPr>
-        <w:spacing w:before="0" w:after="80" w:line="300" w:lineRule="auto"/>
+        <w:spacing w:before="0" w:after="60" w:line="300" w:lineRule="auto"/>
       </w:pPr>
       <w:r>
         <w:rPr>
@@ -2174,29 +2272,7 @@
           <w:b w:val="0"/>
           <w:i w:val="0"/>
           <w:color w:val="222222"/>
-          <w:sz w:val="22"/>
-          <w:lang w:val="ja-JP" w:eastAsia="ja-JP"/>
-        </w:rPr>
-        <w:t>術耐性は攻撃力に対する割合軽減なので、同じRESなら攻撃力が変わっても軽減率は原則同じです。</w:t>
-      </w:r>
-    </w:p>
-    <w:p>
-      <w:pPr>
-        <w:keepNext w:val="0"/>
-        <w:keepLines/>
-        <w:numPr>
-          <w:ilvl w:val="0"/>
-          <w:numId w:val="10"/>
-        </w:numPr>
-        <w:spacing w:before="0" w:after="80" w:line="300" w:lineRule="auto"/>
-      </w:pPr>
-      <w:r>
-        <w:rPr>
-          <w:rFonts w:ascii="Calibri" w:hAnsi="Calibri" w:eastAsia="Yu Gothic"/>
-          <w:b w:val="0"/>
-          <w:i w:val="0"/>
-          <w:color w:val="222222"/>
-          <w:sz w:val="22"/>
+          <w:sz w:val="20"/>
           <w:lang w:val="ja-JP" w:eastAsia="ja-JP"/>
         </w:rPr>
         <w:t>確定ダメージは、防御力・術耐性の影響を受けません。</w:t>
@@ -2218,7 +2294,7 @@
           <w:sz w:val="32"/>
           <w:lang w:val="ja-JP" w:eastAsia="ja-JP"/>
         </w:rPr>
-        <w:t>3. Enemy Analysis での使い分け</w:t>
+        <w:t>4. Enemy Analysis での使い分け</w:t>
       </w:r>
     </w:p>
     <w:p>
@@ -2229,7 +2305,7 @@
           <w:ilvl w:val="0"/>
           <w:numId w:val="11"/>
         </w:numPr>
-        <w:spacing w:before="0" w:after="80" w:line="300" w:lineRule="auto"/>
+        <w:spacing w:before="0" w:after="40" w:line="300" w:lineRule="auto"/>
       </w:pPr>
       <w:r>
         <w:rPr>
@@ -2237,10 +2313,10 @@
           <w:b w:val="0"/>
           <w:i w:val="0"/>
           <w:color w:val="222222"/>
-          <w:sz w:val="22"/>
+          <w:sz w:val="20"/>
           <w:lang w:val="ja-JP" w:eastAsia="ja-JP"/>
         </w:rPr>
-        <w:t>「ゲーム内評価」で、物理と術のどちらが通りやすそうかを大まかに判断する。</w:t>
+        <w:t>「ゲーム内評価」で、物理と術の通りやすさを大まかに判断する。</w:t>
       </w:r>
     </w:p>
     <w:p>
@@ -2251,7 +2327,7 @@
           <w:ilvl w:val="0"/>
           <w:numId w:val="11"/>
         </w:numPr>
-        <w:spacing w:before="0" w:after="80" w:line="300" w:lineRule="auto"/>
+        <w:spacing w:before="0" w:after="40" w:line="300" w:lineRule="auto"/>
       </w:pPr>
       <w:r>
         <w:rPr>
@@ -2259,10 +2335,10 @@
           <w:b w:val="0"/>
           <w:i w:val="0"/>
           <w:color w:val="222222"/>
-          <w:sz w:val="22"/>
+          <w:sz w:val="20"/>
           <w:lang w:val="ja-JP" w:eastAsia="ja-JP"/>
         </w:rPr>
-        <w:t>「実数値」または敵詳細を開き、境界内のどこにいるかを確認する。</w:t>
+        <w:t>「実数値」または敵詳細で、境界内のどこにいるかを確認する。</w:t>
       </w:r>
     </w:p>
     <w:p>
@@ -2273,7 +2349,7 @@
           <w:ilvl w:val="0"/>
           <w:numId w:val="11"/>
         </w:numPr>
-        <w:spacing w:before="0" w:after="80" w:line="300" w:lineRule="auto"/>
+        <w:spacing w:before="0" w:after="40" w:line="300" w:lineRule="auto"/>
       </w:pPr>
       <w:r>
         <w:rPr>
@@ -2281,10 +2357,10 @@
           <w:b w:val="0"/>
           <w:i w:val="0"/>
           <w:color w:val="222222"/>
-          <w:sz w:val="22"/>
+          <w:sz w:val="20"/>
           <w:lang w:val="ja-JP" w:eastAsia="ja-JP"/>
         </w:rPr>
-        <w:t>ダメージ計算機へ実数値を入力し、1ヒット・DPS・総ダメージを比較する。</w:t>
+        <w:t>ダメージ計算機へ実数値を入力し、1ヒット・DPS・総ダメージを比べる。</w:t>
       </w:r>
     </w:p>
     <w:p>
@@ -2295,7 +2371,7 @@
           <w:ilvl w:val="0"/>
           <w:numId w:val="11"/>
         </w:numPr>
-        <w:spacing w:before="0" w:after="80" w:line="300" w:lineRule="auto"/>
+        <w:spacing w:before="0" w:after="40" w:line="300" w:lineRule="auto"/>
       </w:pPr>
       <w:r>
         <w:rPr>
@@ -2303,10 +2379,10 @@
           <w:b w:val="0"/>
           <w:i w:val="0"/>
           <w:color w:val="222222"/>
-          <w:sz w:val="22"/>
+          <w:sz w:val="20"/>
           <w:lang w:val="ja-JP" w:eastAsia="ja-JP"/>
         </w:rPr>
-        <w:t>ステージ固有補正、形態、自己強化、デバフや無視効果がある場合は、基礎値だけで結論を出さない。</w:t>
+        <w:t>ステージ補正、形態、自己強化、デバフや無視効果がある場合は基礎値だけで結論を出さない。</w:t>
       </w:r>
     </w:p>
     <w:p>
@@ -2330,14 +2406,14 @@
           <w:sz w:val="32"/>
           <w:lang w:val="ja-JP" w:eastAsia="ja-JP"/>
         </w:rPr>
-        <w:t>4. 表示値の前提と例外</w:t>
+        <w:t>5. 表示値の前提と例外</w:t>
       </w:r>
     </w:p>
     <w:p>
       <w:pPr>
         <w:keepNext w:val="0"/>
         <w:keepLines/>
-        <w:spacing w:before="0" w:after="120" w:line="300" w:lineRule="auto"/>
+        <w:spacing w:before="0" w:after="80" w:line="288" w:lineRule="auto"/>
       </w:pPr>
       <w:r>
         <w:rPr>
@@ -2345,10 +2421,10 @@
           <w:b/>
           <w:i w:val="0"/>
           <w:color w:val="0B2545"/>
-          <w:sz w:val="22"/>
+          <w:sz w:val="20"/>
           <w:lang w:val="ja-JP" w:eastAsia="ja-JP"/>
         </w:rPr>
-        <w:t xml:space="preserve">基礎ステータス: </w:t>
+        <w:t xml:space="preserve">基礎値: </w:t>
       </w:r>
       <w:r>
         <w:rPr>
@@ -2356,17 +2432,17 @@
           <w:b w:val="0"/>
           <w:i w:val="0"/>
           <w:color w:val="222222"/>
-          <w:sz w:val="22"/>
+          <w:sz w:val="20"/>
           <w:lang w:val="ja-JP" w:eastAsia="ja-JP"/>
         </w:rPr>
-        <w:t>本アプリはJP版ゲームデータの敵図鑑と戦闘データを敵IDで結合し、防御力 def と術耐性 magicResistance を読み取ります。</w:t>
+        <w:t>JP版ゲームデータの敵図鑑と戦闘データを敵IDで結合し、防御力 def と術耐性 magicResistance を読み取ります。複数レベルでは原則レベル0を採用します。</w:t>
       </w:r>
     </w:p>
     <w:p>
       <w:pPr>
         <w:keepNext w:val="0"/>
         <w:keepLines/>
-        <w:spacing w:before="0" w:after="120" w:line="300" w:lineRule="auto"/>
+        <w:spacing w:before="0" w:after="80" w:line="288" w:lineRule="auto"/>
       </w:pPr>
       <w:r>
         <w:rPr>
@@ -2374,36 +2450,7 @@
           <w:b/>
           <w:i w:val="0"/>
           <w:color w:val="0B2545"/>
-          <w:sz w:val="22"/>
-          <w:lang w:val="ja-JP" w:eastAsia="ja-JP"/>
-        </w:rPr>
-        <w:t xml:space="preserve">敵レベル: </w:t>
-      </w:r>
-      <w:r>
-        <w:rPr>
-          <w:rFonts w:ascii="Calibri" w:hAnsi="Calibri" w:eastAsia="Yu Gothic"/>
-          <w:b w:val="0"/>
-          <w:i w:val="0"/>
-          <w:color w:val="222222"/>
-          <w:sz w:val="22"/>
-          <w:lang w:val="ja-JP" w:eastAsia="ja-JP"/>
-        </w:rPr>
-        <w:t>複数レベルがある場合は原則レベル0を採用し、存在しなければレベル順の先頭を用います。</w:t>
-      </w:r>
-    </w:p>
-    <w:p>
-      <w:pPr>
-        <w:keepNext w:val="0"/>
-        <w:keepLines/>
-        <w:spacing w:before="0" w:after="120" w:line="300" w:lineRule="auto"/>
-      </w:pPr>
-      <w:r>
-        <w:rPr>
-          <w:rFonts w:ascii="Calibri" w:hAnsi="Calibri" w:eastAsia="Yu Gothic"/>
-          <w:b/>
-          <w:i w:val="0"/>
-          <w:color w:val="0B2545"/>
-          <w:sz w:val="22"/>
+          <w:sz w:val="20"/>
           <w:lang w:val="ja-JP" w:eastAsia="ja-JP"/>
         </w:rPr>
         <w:t xml:space="preserve">ステージ差: </w:t>
@@ -2414,17 +2461,17 @@
           <w:b w:val="0"/>
           <w:i w:val="0"/>
           <w:color w:val="222222"/>
-          <w:sz w:val="22"/>
+          <w:sz w:val="20"/>
           <w:lang w:val="ja-JP" w:eastAsia="ja-JP"/>
         </w:rPr>
-        <w:t>ゲーム内のSp.は、そのステージの敵が図鑑の標準情報と異なることを示します。本アプリの一覧・統計はステージ固有条件やイベント補正を反映しません。</w:t>
+        <w:t>ゲーム内のSp.は、そのステージの敵が図鑑の標準情報と異なることを示します。本アプリはステージ固有条件やイベント補正を反映しません。</w:t>
       </w:r>
     </w:p>
     <w:p>
       <w:pPr>
         <w:keepNext w:val="0"/>
         <w:keepLines/>
-        <w:spacing w:before="0" w:after="120" w:line="300" w:lineRule="auto"/>
+        <w:spacing w:before="0" w:after="80" w:line="288" w:lineRule="auto"/>
       </w:pPr>
       <w:r>
         <w:rPr>
@@ -2432,7 +2479,7 @@
           <w:b/>
           <w:i w:val="0"/>
           <w:color w:val="0B2545"/>
-          <w:sz w:val="22"/>
+          <w:sz w:val="20"/>
           <w:lang w:val="ja-JP" w:eastAsia="ja-JP"/>
         </w:rPr>
         <w:t xml:space="preserve">形態・能力: </w:t>
@@ -2443,17 +2490,17 @@
           <w:b w:val="0"/>
           <w:i w:val="0"/>
           <w:color w:val="222222"/>
-          <w:sz w:val="22"/>
+          <w:sz w:val="20"/>
           <w:lang w:val="ja-JP" w:eastAsia="ja-JP"/>
         </w:rPr>
-        <w:t>形態変化、自己強化、強襲条件、契約、味方のデバフや防御・術耐性無視により、戦闘中の実効値は変わります。</w:t>
+        <w:t>形態変化、自己強化、強襲条件、契約、デバフや防御・術耐性無視により、戦闘中の実効値は変わります。</w:t>
       </w:r>
     </w:p>
     <w:p>
       <w:pPr>
         <w:keepNext w:val="0"/>
         <w:keepLines/>
-        <w:spacing w:before="0" w:after="120" w:line="300" w:lineRule="auto"/>
+        <w:spacing w:before="0" w:after="80" w:line="288" w:lineRule="auto"/>
       </w:pPr>
       <w:r>
         <w:rPr>
@@ -2461,7 +2508,7 @@
           <w:b/>
           <w:i w:val="0"/>
           <w:color w:val="0B2545"/>
-          <w:sz w:val="22"/>
+          <w:sz w:val="20"/>
           <w:lang w:val="ja-JP" w:eastAsia="ja-JP"/>
         </w:rPr>
         <w:t xml:space="preserve">境界と丸め: </w:t>
@@ -2472,10 +2519,10 @@
           <w:b w:val="0"/>
           <w:i w:val="0"/>
           <w:color w:val="222222"/>
-          <w:sz w:val="22"/>
+          <w:sz w:val="20"/>
           <w:lang w:val="ja-JP" w:eastAsia="ja-JP"/>
         </w:rPr>
-        <w:t>評価は丸め前の実数値で判定します。境界付近に小数値がある場合、整数表示との見た目が直感に合わないことがあります。</w:t>
+        <w:t>評価は丸め前の値で判定します。境界付近に小数値があると、整数表示との見た目が直感に合わない場合があります。</w:t>
       </w:r>
     </w:p>
     <w:tbl>
@@ -2568,7 +2615,7 @@
           <w:sz w:val="32"/>
           <w:lang w:val="ja-JP" w:eastAsia="ja-JP"/>
         </w:rPr>
-        <w:t>5. 読み取りチェックリスト</w:t>
+        <w:t>6. 読み取りチェックリスト</w:t>
       </w:r>
     </w:p>
     <w:p>
@@ -2577,9 +2624,9 @@
         <w:keepLines/>
         <w:numPr>
           <w:ilvl w:val="0"/>
-          <w:numId w:val="11"/>
+          <w:numId w:val="10"/>
         </w:numPr>
-        <w:spacing w:before="0" w:after="60" w:line="300" w:lineRule="auto"/>
+        <w:spacing w:before="0" w:after="40" w:line="300" w:lineRule="auto"/>
       </w:pPr>
       <w:r>
         <w:rPr>
@@ -2587,7 +2634,7 @@
           <w:b w:val="0"/>
           <w:i w:val="0"/>
           <w:color w:val="222222"/>
-          <w:sz w:val="22"/>
+          <w:sz w:val="20"/>
           <w:lang w:val="ja-JP" w:eastAsia="ja-JP"/>
         </w:rPr>
         <w:t>文字ランクは正確な数値ではなく、範囲だと理解している。</w:t>
@@ -2599,9 +2646,9 @@
         <w:keepLines/>
         <w:numPr>
           <w:ilvl w:val="0"/>
-          <w:numId w:val="11"/>
+          <w:numId w:val="10"/>
         </w:numPr>
-        <w:spacing w:before="0" w:after="60" w:line="300" w:lineRule="auto"/>
+        <w:spacing w:before="0" w:after="40" w:line="300" w:lineRule="auto"/>
       </w:pPr>
       <w:r>
         <w:rPr>
@@ -2609,7 +2656,7 @@
           <w:b w:val="0"/>
           <w:i w:val="0"/>
           <w:color w:val="222222"/>
-          <w:sz w:val="22"/>
+          <w:sz w:val="20"/>
           <w:lang w:val="ja-JP" w:eastAsia="ja-JP"/>
         </w:rPr>
         <w:t>防御力は固定値減算、術耐性は割合軽減として別々に読んでいる。</w:t>
@@ -2621,9 +2668,9 @@
         <w:keepLines/>
         <w:numPr>
           <w:ilvl w:val="0"/>
-          <w:numId w:val="11"/>
+          <w:numId w:val="10"/>
         </w:numPr>
-        <w:spacing w:before="0" w:after="60" w:line="300" w:lineRule="auto"/>
+        <w:spacing w:before="0" w:after="40" w:line="300" w:lineRule="auto"/>
       </w:pPr>
       <w:r>
         <w:rPr>
@@ -2631,10 +2678,10 @@
           <w:b w:val="0"/>
           <w:i w:val="0"/>
           <w:color w:val="222222"/>
-          <w:sz w:val="22"/>
+          <w:sz w:val="20"/>
           <w:lang w:val="ja-JP" w:eastAsia="ja-JP"/>
         </w:rPr>
-        <w:t>境界値では実数値表示または敵詳細を確認している。</w:t>
+        <w:t>実数値、Sp.、形態・能力説明、ステージ固有補正を確認している。</w:t>
       </w:r>
     </w:p>
     <w:p>
@@ -2643,9 +2690,9 @@
         <w:keepLines/>
         <w:numPr>
           <w:ilvl w:val="0"/>
-          <w:numId w:val="11"/>
+          <w:numId w:val="10"/>
         </w:numPr>
-        <w:spacing w:before="0" w:after="60" w:line="300" w:lineRule="auto"/>
+        <w:spacing w:before="0" w:after="40" w:line="300" w:lineRule="auto"/>
       </w:pPr>
       <w:r>
         <w:rPr>
@@ -2653,32 +2700,10 @@
           <w:b w:val="0"/>
           <w:i w:val="0"/>
           <w:color w:val="222222"/>
-          <w:sz w:val="22"/>
+          <w:sz w:val="20"/>
           <w:lang w:val="ja-JP" w:eastAsia="ja-JP"/>
         </w:rPr>
-        <w:t>ステージ固有補正・Sp.・形態・能力説明を確認している。</w:t>
-      </w:r>
-    </w:p>
-    <w:p>
-      <w:pPr>
-        <w:keepNext w:val="0"/>
-        <w:keepLines/>
-        <w:numPr>
-          <w:ilvl w:val="0"/>
-          <w:numId w:val="11"/>
-        </w:numPr>
-        <w:spacing w:before="0" w:after="60" w:line="300" w:lineRule="auto"/>
-      </w:pPr>
-      <w:r>
-        <w:rPr>
-          <w:rFonts w:ascii="Calibri" w:hAnsi="Calibri" w:eastAsia="Yu Gothic"/>
-          <w:b w:val="0"/>
-          <w:i w:val="0"/>
-          <w:color w:val="222222"/>
-          <w:sz w:val="22"/>
-          <w:lang w:val="ja-JP" w:eastAsia="ja-JP"/>
-        </w:rPr>
-        <w:t>最終判断はダメージ計算機で実数値を使って比較している。</w:t>
+        <w:t>最終判断はダメージ計算機で実数値を使っている。</w:t>
       </w:r>
     </w:p>
     <w:p>
@@ -2697,7 +2722,7 @@
           <w:sz w:val="32"/>
           <w:lang w:val="ja-JP" w:eastAsia="ja-JP"/>
         </w:rPr>
-        <w:t>6. 参照情報</w:t>
+        <w:t>7. 参照情報</w:t>
       </w:r>
     </w:p>
     <w:p>
@@ -2739,18 +2764,17 @@
         </w:rPr>
         <w:t xml:space="preserve">公式: </w:t>
       </w:r>
-      <w:r>
-        <w:rPr>
-          <w:rFonts w:ascii="Calibri" w:hAnsi="Calibri" w:eastAsia="Yu Gothic"/>
-          <w:b w:val="0"/>
-          <w:i w:val="0"/>
-          <w:color w:val="2E74B5"/>
-          <w:sz w:val="19"/>
-          <w:u w:val="single"/>
-          <w:lang w:val="ja-JP" w:eastAsia="ja-JP"/>
-        </w:rPr>
-        <w:t>アークナイツ公式 アプリ更新のお知らせ</w:t>
-      </w:r>
+      <w:hyperlink r:id="rId11">
+        <w:r>
+          <w:rPr>
+            <w:rFonts w:ascii="Calibri" w:hAnsi="Calibri" w:eastAsia="Yu Gothic"/>
+            <w:color w:val="2E74B5"/>
+            <w:u w:val="single"/>
+            <w:sz w:val="19"/>
+          </w:rPr>
+          <w:t>アークナイツ公式 アプリ更新のお知らせ</w:t>
+        </w:r>
+      </w:hyperlink>
       <w:r>
         <w:rPr>
           <w:rFonts w:ascii="Calibri" w:hAnsi="Calibri" w:eastAsia="Yu Gothic"/>
@@ -2784,18 +2808,17 @@
         </w:rPr>
         <w:t xml:space="preserve">開発側告知: </w:t>
       </w:r>
-      <w:r>
-        <w:rPr>
-          <w:rFonts w:ascii="Calibri" w:hAnsi="Calibri" w:eastAsia="Yu Gothic"/>
-          <w:b w:val="0"/>
-          <w:i w:val="0"/>
-          <w:color w:val="2E74B5"/>
-          <w:sz w:val="19"/>
-          <w:u w:val="single"/>
-          <w:lang w:val="ja-JP" w:eastAsia="ja-JP"/>
-        </w:rPr>
-        <w:t>敵方档案库优化内容前瞻</w:t>
-      </w:r>
+      <w:hyperlink r:id="rId12">
+        <w:r>
+          <w:rPr>
+            <w:rFonts w:ascii="Calibri" w:hAnsi="Calibri" w:eastAsia="Yu Gothic"/>
+            <w:color w:val="2E74B5"/>
+            <w:u w:val="single"/>
+            <w:sz w:val="19"/>
+          </w:rPr>
+          <w:t>敵方档案库优化内容前瞻</w:t>
+        </w:r>
+      </w:hyperlink>
       <w:r>
         <w:rPr>
           <w:rFonts w:ascii="Calibri" w:hAnsi="Calibri" w:eastAsia="Yu Gothic"/>
@@ -2829,18 +2852,17 @@
         </w:rPr>
         <w:t xml:space="preserve">補助資料: </w:t>
       </w:r>
-      <w:r>
-        <w:rPr>
-          <w:rFonts w:ascii="Calibri" w:hAnsi="Calibri" w:eastAsia="Yu Gothic"/>
-          <w:b w:val="0"/>
-          <w:i w:val="0"/>
-          <w:color w:val="2E74B5"/>
-          <w:sz w:val="19"/>
-          <w:u w:val="single"/>
-          <w:lang w:val="ja-JP" w:eastAsia="ja-JP"/>
-        </w:rPr>
-        <w:t>Arknights Terra Wiki - DEF / RES / UI UX Changes</w:t>
-      </w:r>
+      <w:hyperlink r:id="rId13">
+        <w:r>
+          <w:rPr>
+            <w:rFonts w:ascii="Calibri" w:hAnsi="Calibri" w:eastAsia="Yu Gothic"/>
+            <w:color w:val="2E74B5"/>
+            <w:u w:val="single"/>
+            <w:sz w:val="19"/>
+          </w:rPr>
+          <w:t>Arknights Terra Wiki - DEF / RES / UI UX Changes</w:t>
+        </w:r>
+      </w:hyperlink>
       <w:r>
         <w:rPr>
           <w:rFonts w:ascii="Calibri" w:hAnsi="Calibri" w:eastAsia="Yu Gothic"/>
@@ -2874,18 +2896,17 @@
         </w:rPr>
         <w:t xml:space="preserve">計算式: </w:t>
       </w:r>
-      <w:r>
-        <w:rPr>
-          <w:rFonts w:ascii="Calibri" w:hAnsi="Calibri" w:eastAsia="Yu Gothic"/>
-          <w:b w:val="0"/>
-          <w:i w:val="0"/>
-          <w:color w:val="2E74B5"/>
-          <w:sz w:val="19"/>
-          <w:u w:val="single"/>
-          <w:lang w:val="ja-JP" w:eastAsia="ja-JP"/>
-        </w:rPr>
-        <w:t>Arknights Terra Wiki - Physical damage / Arts damage</w:t>
-      </w:r>
+      <w:hyperlink r:id="rId14">
+        <w:r>
+          <w:rPr>
+            <w:rFonts w:ascii="Calibri" w:hAnsi="Calibri" w:eastAsia="Yu Gothic"/>
+            <w:color w:val="2E74B5"/>
+            <w:u w:val="single"/>
+            <w:sz w:val="19"/>
+          </w:rPr>
+          <w:t>Arknights Terra Wiki - Physical damage / Arts damage</w:t>
+        </w:r>
+      </w:hyperlink>
       <w:r>
         <w:rPr>
           <w:rFonts w:ascii="Calibri" w:hAnsi="Calibri" w:eastAsia="Yu Gothic"/>
@@ -2896,24 +2917,6 @@
           <w:lang w:val="ja-JP" w:eastAsia="ja-JP"/>
         </w:rPr>
         <w:t>（減算・割合軽減・最低保証）</w:t>
-      </w:r>
-    </w:p>
-    <w:p>
-      <w:pPr>
-        <w:keepNext w:val="0"/>
-        <w:keepLines/>
-        <w:spacing w:before="80" w:after="0" w:line="276" w:lineRule="auto"/>
-      </w:pPr>
-      <w:r>
-        <w:rPr>
-          <w:rFonts w:ascii="Calibri" w:hAnsi="Calibri" w:eastAsia="Yu Gothic"/>
-          <w:b w:val="0"/>
-          <w:i w:val="0"/>
-          <w:color w:val="5B6570"/>
-          <w:sz w:val="17"/>
-          <w:lang w:val="ja-JP" w:eastAsia="ja-JP"/>
-        </w:rPr>
-        <w:t>基準日: 2026-08-31。公式はランク境界の数値表を公開していないため、本書の厳密な境界は本アプリの実装を基準とし、外部Wikiの概算表は補助情報として扱います。</w:t>
       </w:r>
     </w:p>
     <w:sectPr>

</xml_diff>

<commit_message>
feat: Add implementation policy document for traits and qualities
- Created a new markdown document detailing the implementation policy for traits and qualities, including objectives, current status, basic policies, data design, and implementation phases.
- Added a manifest file for the document with metadata and file paths.
- Included a receipt file for tracking document processing status.
- Updated CSS for the enemy analysis component to improve layout and styling.
- Modified Python script for building enemy notation guide to adjust table geometry.
- Updated package diff JSON to reflect changes in final document SHA256.
</commit_message>
<xml_diff>
--- a/docs/enemy-defense-resistance-notation-guide.docx
+++ b/docs/enemy-defense-resistance-notation-guide.docx
@@ -80,7 +80,7 @@
         <w:tblW w:type="dxa" w:w="9360"/>
         <w:tblLayout w:type="fixed"/>
         <w:tblLook w:firstColumn="1" w:firstRow="1" w:lastColumn="0" w:lastRow="0" w:noHBand="0" w:noVBand="1" w:val="04A0"/>
-        <w:tblInd w:type="dxa" w:w="120"/>
+        <w:tblInd w:type="dxa" w:w="170"/>
       </w:tblPr>
       <w:tblGrid>
         <w:gridCol w:w="9360"/>
@@ -257,7 +257,7 @@
         <w:tblW w:type="dxa" w:w="9360"/>
         <w:tblLayout w:type="fixed"/>
         <w:tblLook w:firstColumn="1" w:firstRow="1" w:lastColumn="0" w:lastRow="0" w:noHBand="0" w:noVBand="1" w:val="04A0"/>
-        <w:tblInd w:type="dxa" w:w="120"/>
+        <w:tblInd w:type="dxa" w:w="170"/>
       </w:tblPr>
       <w:tblGrid>
         <w:gridCol w:w="9360"/>
@@ -2086,7 +2086,7 @@
         <w:tblW w:type="dxa" w:w="9360"/>
         <w:tblLayout w:type="fixed"/>
         <w:tblLook w:firstColumn="1" w:firstRow="1" w:lastColumn="0" w:lastRow="0" w:noHBand="0" w:noVBand="1" w:val="04A0"/>
-        <w:tblInd w:type="dxa" w:w="120"/>
+        <w:tblInd w:type="dxa" w:w="170"/>
       </w:tblPr>
       <w:tblGrid>
         <w:gridCol w:w="9360"/>
@@ -2530,7 +2530,7 @@
         <w:tblW w:type="dxa" w:w="9360"/>
         <w:tblLayout w:type="fixed"/>
         <w:tblLook w:firstColumn="1" w:firstRow="1" w:lastColumn="0" w:lastRow="0" w:noHBand="0" w:noVBand="1" w:val="04A0"/>
-        <w:tblInd w:type="dxa" w:w="120"/>
+        <w:tblInd w:type="dxa" w:w="170"/>
       </w:tblPr>
       <w:tblGrid>
         <w:gridCol w:w="9360"/>

</xml_diff>